<commit_message>
docs: update reflection_phase1.docx; ignore Word lock files
Made-with: Cursor
</commit_message>
<xml_diff>
--- a/reflection_phase1.docx
+++ b/reflection_phase1.docx
@@ -1405,16 +1405,197 @@
           <w:szCs w:val="28"/>
         </w:rPr>
       </w:pPr>
-      <w:r>
-        <w:rPr>
-          <w:rFonts w:ascii="Times New Roman" w:hAnsi="Times New Roman" w:cs="Times New Roman"/>
-          <w:b/>
-          <w:bCs/>
-          <w:color w:val="4EA72E" w:themeColor="accent6"/>
-          <w:sz w:val="28"/>
-          <w:szCs w:val="28"/>
-        </w:rPr>
-        <w:t>6. Explain how you represented the following: RPM, Fuel level, Speed, Engine state. Why did you</w:t>
+    </w:p>
+    <w:p>
+      <w:pPr>
+        <w:spacing w:line="480" w:lineRule="auto"/>
+        <w:rPr>
+          <w:rFonts w:ascii="Times New Roman" w:hAnsi="Times New Roman" w:cs="Times New Roman"/>
+          <w:b/>
+          <w:bCs/>
+          <w:color w:val="4EA72E" w:themeColor="accent6"/>
+          <w:sz w:val="28"/>
+          <w:szCs w:val="28"/>
+        </w:rPr>
+      </w:pPr>
+      <w:r>
+        <w:rPr>
+          <w:rFonts w:ascii="Times New Roman" w:hAnsi="Times New Roman" w:cs="Times New Roman"/>
+          <w:b/>
+          <w:bCs/>
+          <w:noProof/>
+          <w:color w:val="4EA72E" w:themeColor="accent6"/>
+          <w:sz w:val="28"/>
+          <w:szCs w:val="28"/>
+        </w:rPr>
+        <w:lastRenderedPageBreak/>
+        <w:drawing>
+          <wp:inline distT="0" distB="0" distL="0" distR="0" wp14:anchorId="7713B6DB" wp14:editId="02AEA7BD">
+            <wp:extent cx="5654180" cy="2522828"/>
+            <wp:effectExtent l="0" t="0" r="0" b="5080"/>
+            <wp:docPr id="651127173" name="Picture 1"/>
+            <wp:cNvGraphicFramePr>
+              <a:graphicFrameLocks xmlns:a="http://schemas.openxmlformats.org/drawingml/2006/main" noChangeAspect="1"/>
+            </wp:cNvGraphicFramePr>
+            <a:graphic xmlns:a="http://schemas.openxmlformats.org/drawingml/2006/main">
+              <a:graphicData uri="http://schemas.openxmlformats.org/drawingml/2006/picture">
+                <pic:pic xmlns:pic="http://schemas.openxmlformats.org/drawingml/2006/picture">
+                  <pic:nvPicPr>
+                    <pic:cNvPr id="651127173" name="Picture 651127173"/>
+                    <pic:cNvPicPr/>
+                  </pic:nvPicPr>
+                  <pic:blipFill>
+                    <a:blip r:embed="rId5">
+                      <a:extLst>
+                        <a:ext uri="{28A0092B-C50C-407E-A947-70E740481C1C}">
+                          <a14:useLocalDpi xmlns:a14="http://schemas.microsoft.com/office/drawing/2010/main" val="0"/>
+                        </a:ext>
+                      </a:extLst>
+                    </a:blip>
+                    <a:stretch>
+                      <a:fillRect/>
+                    </a:stretch>
+                  </pic:blipFill>
+                  <pic:spPr>
+                    <a:xfrm>
+                      <a:off x="0" y="0"/>
+                      <a:ext cx="6021605" cy="2686769"/>
+                    </a:xfrm>
+                    <a:prstGeom prst="rect">
+                      <a:avLst/>
+                    </a:prstGeom>
+                  </pic:spPr>
+                </pic:pic>
+              </a:graphicData>
+            </a:graphic>
+          </wp:inline>
+        </w:drawing>
+      </w:r>
+      <w:r>
+        <w:rPr>
+          <w:rFonts w:ascii="Times New Roman" w:hAnsi="Times New Roman" w:cs="Times New Roman"/>
+          <w:b/>
+          <w:bCs/>
+          <w:noProof/>
+          <w:color w:val="4EA72E" w:themeColor="accent6"/>
+          <w:sz w:val="28"/>
+          <w:szCs w:val="28"/>
+        </w:rPr>
+        <w:drawing>
+          <wp:inline distT="0" distB="0" distL="0" distR="0" wp14:anchorId="577FDAA5" wp14:editId="4BA09CAD">
+            <wp:extent cx="5575300" cy="2578100"/>
+            <wp:effectExtent l="0" t="0" r="0" b="0"/>
+            <wp:docPr id="383429161" name="Picture 2"/>
+            <wp:cNvGraphicFramePr>
+              <a:graphicFrameLocks xmlns:a="http://schemas.openxmlformats.org/drawingml/2006/main" noChangeAspect="1"/>
+            </wp:cNvGraphicFramePr>
+            <a:graphic xmlns:a="http://schemas.openxmlformats.org/drawingml/2006/main">
+              <a:graphicData uri="http://schemas.openxmlformats.org/drawingml/2006/picture">
+                <pic:pic xmlns:pic="http://schemas.openxmlformats.org/drawingml/2006/picture">
+                  <pic:nvPicPr>
+                    <pic:cNvPr id="383429161" name="Picture 383429161"/>
+                    <pic:cNvPicPr/>
+                  </pic:nvPicPr>
+                  <pic:blipFill>
+                    <a:blip r:embed="rId6">
+                      <a:extLst>
+                        <a:ext uri="{28A0092B-C50C-407E-A947-70E740481C1C}">
+                          <a14:useLocalDpi xmlns:a14="http://schemas.microsoft.com/office/drawing/2010/main" val="0"/>
+                        </a:ext>
+                      </a:extLst>
+                    </a:blip>
+                    <a:stretch>
+                      <a:fillRect/>
+                    </a:stretch>
+                  </pic:blipFill>
+                  <pic:spPr>
+                    <a:xfrm>
+                      <a:off x="0" y="0"/>
+                      <a:ext cx="5575300" cy="2578100"/>
+                    </a:xfrm>
+                    <a:prstGeom prst="rect">
+                      <a:avLst/>
+                    </a:prstGeom>
+                  </pic:spPr>
+                </pic:pic>
+              </a:graphicData>
+            </a:graphic>
+          </wp:inline>
+        </w:drawing>
+      </w:r>
+    </w:p>
+    <w:p>
+      <w:pPr>
+        <w:spacing w:line="480" w:lineRule="auto"/>
+        <w:rPr>
+          <w:rFonts w:ascii="Times New Roman" w:hAnsi="Times New Roman" w:cs="Times New Roman"/>
+          <w:color w:val="0D0D0D" w:themeColor="text1" w:themeTint="F2"/>
+          <w:sz w:val="28"/>
+          <w:szCs w:val="28"/>
+        </w:rPr>
+      </w:pPr>
+      <w:r>
+        <w:rPr>
+          <w:rFonts w:ascii="Times New Roman" w:hAnsi="Times New Roman" w:cs="Times New Roman"/>
+          <w:color w:val="0D0D0D" w:themeColor="text1" w:themeTint="F2"/>
+          <w:sz w:val="28"/>
+          <w:szCs w:val="28"/>
+        </w:rPr>
+        <w:t>For the design of our dashboard, w</w:t>
+      </w:r>
+      <w:r>
+        <w:rPr>
+          <w:rFonts w:ascii="Times New Roman" w:hAnsi="Times New Roman" w:cs="Times New Roman"/>
+          <w:color w:val="0D0D0D" w:themeColor="text1" w:themeTint="F2"/>
+          <w:sz w:val="28"/>
+          <w:szCs w:val="28"/>
+        </w:rPr>
+        <w:t>e prioritized minimalism and the exa</w:t>
+      </w:r>
+      <w:r>
+        <w:rPr>
+          <w:rFonts w:ascii="Times New Roman" w:hAnsi="Times New Roman" w:cs="Times New Roman"/>
+          <w:color w:val="0D0D0D" w:themeColor="text1" w:themeTint="F2"/>
+          <w:sz w:val="28"/>
+          <w:szCs w:val="28"/>
+        </w:rPr>
+        <w:t>mple we saw on Canvas.</w:t>
+      </w:r>
+    </w:p>
+    <w:p>
+      <w:pPr>
+        <w:spacing w:line="480" w:lineRule="auto"/>
+        <w:rPr>
+          <w:rFonts w:ascii="Times New Roman" w:hAnsi="Times New Roman" w:cs="Times New Roman"/>
+          <w:b/>
+          <w:bCs/>
+          <w:color w:val="4EA72E" w:themeColor="accent6"/>
+          <w:sz w:val="28"/>
+          <w:szCs w:val="28"/>
+        </w:rPr>
+      </w:pPr>
+      <w:r>
+        <w:rPr>
+          <w:rFonts w:ascii="Times New Roman" w:hAnsi="Times New Roman" w:cs="Times New Roman"/>
+          <w:b/>
+          <w:bCs/>
+          <w:color w:val="4EA72E" w:themeColor="accent6"/>
+          <w:sz w:val="28"/>
+          <w:szCs w:val="28"/>
+        </w:rPr>
+        <w:t xml:space="preserve">6. </w:t>
+      </w:r>
+      <w:bookmarkStart w:id="0" w:name="OLE_LINK1"/>
+      <w:r>
+        <w:rPr>
+          <w:rFonts w:ascii="Times New Roman" w:hAnsi="Times New Roman" w:cs="Times New Roman"/>
+          <w:b/>
+          <w:bCs/>
+          <w:color w:val="4EA72E" w:themeColor="accent6"/>
+          <w:sz w:val="28"/>
+          <w:szCs w:val="28"/>
+        </w:rPr>
+        <w:t>Explain how you represented the following: RPM, Fuel level, Speed, Engine state. Why did you</w:t>
       </w:r>
       <w:r>
         <w:rPr>
@@ -1438,38 +1619,365 @@
         </w:rPr>
         <w:t>choose numeric values, bars, symbols, or a hybrid approach?</w:t>
       </w:r>
-    </w:p>
-    <w:p>
-      <w:pPr>
-        <w:spacing w:line="480" w:lineRule="auto"/>
-        <w:rPr>
-          <w:rFonts w:ascii="Times New Roman" w:hAnsi="Times New Roman" w:cs="Times New Roman"/>
-          <w:b/>
-          <w:bCs/>
-        </w:rPr>
-      </w:pPr>
-    </w:p>
-    <w:p>
-      <w:pPr>
-        <w:spacing w:line="480" w:lineRule="auto"/>
-        <w:rPr>
-          <w:rFonts w:ascii="Times New Roman" w:hAnsi="Times New Roman" w:cs="Times New Roman"/>
-          <w:b/>
-          <w:bCs/>
-          <w:color w:val="4EA72E" w:themeColor="accent6"/>
-          <w:sz w:val="28"/>
-          <w:szCs w:val="28"/>
-        </w:rPr>
-      </w:pPr>
-      <w:r>
-        <w:rPr>
-          <w:rFonts w:ascii="Times New Roman" w:hAnsi="Times New Roman" w:cs="Times New Roman"/>
-          <w:b/>
-          <w:bCs/>
-          <w:color w:val="4EA72E" w:themeColor="accent6"/>
-          <w:sz w:val="28"/>
-          <w:szCs w:val="28"/>
-        </w:rPr>
+      <w:bookmarkEnd w:id="0"/>
+    </w:p>
+    <w:p>
+      <w:pPr>
+        <w:spacing w:line="480" w:lineRule="auto"/>
+        <w:rPr>
+          <w:rFonts w:ascii="Times New Roman" w:hAnsi="Times New Roman" w:cs="Times New Roman"/>
+          <w:b/>
+          <w:bCs/>
+          <w:color w:val="0D0D0D" w:themeColor="text1" w:themeTint="F2"/>
+          <w:lang w:val="en-CA"/>
+        </w:rPr>
+      </w:pPr>
+      <w:r>
+        <w:rPr>
+          <w:rFonts w:ascii="Times New Roman" w:hAnsi="Times New Roman" w:cs="Times New Roman"/>
+          <w:b/>
+          <w:bCs/>
+          <w:color w:val="0D0D0D" w:themeColor="text1" w:themeTint="F2"/>
+          <w:lang w:val="en-CA"/>
+        </w:rPr>
+        <w:lastRenderedPageBreak/>
+        <w:t>RPM (engine speed)</w:t>
+      </w:r>
+    </w:p>
+    <w:p>
+      <w:pPr>
+        <w:numPr>
+          <w:ilvl w:val="0"/>
+          <w:numId w:val="1"/>
+        </w:numPr>
+        <w:spacing w:line="480" w:lineRule="auto"/>
+        <w:rPr>
+          <w:rFonts w:ascii="Times New Roman" w:hAnsi="Times New Roman" w:cs="Times New Roman"/>
+          <w:b/>
+          <w:bCs/>
+          <w:color w:val="0D0D0D" w:themeColor="text1" w:themeTint="F2"/>
+          <w:lang w:val="en-CA"/>
+        </w:rPr>
+      </w:pPr>
+      <w:r>
+        <w:rPr>
+          <w:rFonts w:ascii="Times New Roman" w:hAnsi="Times New Roman" w:cs="Times New Roman"/>
+          <w:b/>
+          <w:bCs/>
+          <w:color w:val="0D0D0D" w:themeColor="text1" w:themeTint="F2"/>
+          <w:lang w:val="en-CA"/>
+        </w:rPr>
+        <w:t xml:space="preserve">Hybrid: a numeric value (5858), a text label ([NORMAL]), a symbol (green dot as “running/OK”), and an ASCII bar (#######................) for quick “how hard it’s working” </w:t>
+      </w:r>
+      <w:proofErr w:type="gramStart"/>
+      <w:r>
+        <w:rPr>
+          <w:rFonts w:ascii="Times New Roman" w:hAnsi="Times New Roman" w:cs="Times New Roman"/>
+          <w:b/>
+          <w:bCs/>
+          <w:color w:val="0D0D0D" w:themeColor="text1" w:themeTint="F2"/>
+          <w:lang w:val="en-CA"/>
+        </w:rPr>
+        <w:t>at a glance</w:t>
+      </w:r>
+      <w:proofErr w:type="gramEnd"/>
+      <w:r>
+        <w:rPr>
+          <w:rFonts w:ascii="Times New Roman" w:hAnsi="Times New Roman" w:cs="Times New Roman"/>
+          <w:b/>
+          <w:bCs/>
+          <w:color w:val="0D0D0D" w:themeColor="text1" w:themeTint="F2"/>
+          <w:lang w:val="en-CA"/>
+        </w:rPr>
+        <w:t>.</w:t>
+      </w:r>
+    </w:p>
+    <w:p>
+      <w:pPr>
+        <w:numPr>
+          <w:ilvl w:val="0"/>
+          <w:numId w:val="1"/>
+        </w:numPr>
+        <w:spacing w:line="480" w:lineRule="auto"/>
+        <w:rPr>
+          <w:rFonts w:ascii="Times New Roman" w:hAnsi="Times New Roman" w:cs="Times New Roman"/>
+          <w:b/>
+          <w:bCs/>
+          <w:color w:val="0D0D0D" w:themeColor="text1" w:themeTint="F2"/>
+          <w:lang w:val="en-CA"/>
+        </w:rPr>
+      </w:pPr>
+      <w:r>
+        <w:rPr>
+          <w:rFonts w:ascii="Times New Roman" w:hAnsi="Times New Roman" w:cs="Times New Roman"/>
+          <w:b/>
+          <w:bCs/>
+          <w:color w:val="0D0D0D" w:themeColor="text1" w:themeTint="F2"/>
+          <w:lang w:val="en-CA"/>
+        </w:rPr>
+        <w:t xml:space="preserve">The bar is normalized to a fixed </w:t>
+      </w:r>
+      <w:proofErr w:type="gramStart"/>
+      <w:r>
+        <w:rPr>
+          <w:rFonts w:ascii="Times New Roman" w:hAnsi="Times New Roman" w:cs="Times New Roman"/>
+          <w:b/>
+          <w:bCs/>
+          <w:color w:val="0D0D0D" w:themeColor="text1" w:themeTint="F2"/>
+          <w:lang w:val="en-CA"/>
+        </w:rPr>
+        <w:t>width</w:t>
+      </w:r>
+      <w:proofErr w:type="gramEnd"/>
+      <w:r>
+        <w:rPr>
+          <w:rFonts w:ascii="Times New Roman" w:hAnsi="Times New Roman" w:cs="Times New Roman"/>
+          <w:b/>
+          <w:bCs/>
+          <w:color w:val="0D0D0D" w:themeColor="text1" w:themeTint="F2"/>
+          <w:lang w:val="en-CA"/>
+        </w:rPr>
+        <w:t xml:space="preserve"> so it reads like a gauge even in a text-only UI.</w:t>
+      </w:r>
+    </w:p>
+    <w:p>
+      <w:pPr>
+        <w:spacing w:line="480" w:lineRule="auto"/>
+        <w:rPr>
+          <w:rFonts w:ascii="Times New Roman" w:hAnsi="Times New Roman" w:cs="Times New Roman"/>
+          <w:b/>
+          <w:bCs/>
+          <w:color w:val="0D0D0D" w:themeColor="text1" w:themeTint="F2"/>
+          <w:lang w:val="en-CA"/>
+        </w:rPr>
+      </w:pPr>
+      <w:r>
+        <w:rPr>
+          <w:rFonts w:ascii="Times New Roman" w:hAnsi="Times New Roman" w:cs="Times New Roman"/>
+          <w:b/>
+          <w:bCs/>
+          <w:color w:val="0D0D0D" w:themeColor="text1" w:themeTint="F2"/>
+          <w:lang w:val="en-CA"/>
+        </w:rPr>
+        <w:t>Fuel level</w:t>
+      </w:r>
+    </w:p>
+    <w:p>
+      <w:pPr>
+        <w:numPr>
+          <w:ilvl w:val="0"/>
+          <w:numId w:val="2"/>
+        </w:numPr>
+        <w:spacing w:line="480" w:lineRule="auto"/>
+        <w:rPr>
+          <w:rFonts w:ascii="Times New Roman" w:hAnsi="Times New Roman" w:cs="Times New Roman"/>
+          <w:b/>
+          <w:bCs/>
+          <w:color w:val="0D0D0D" w:themeColor="text1" w:themeTint="F2"/>
+          <w:lang w:val="en-CA"/>
+        </w:rPr>
+      </w:pPr>
+      <w:r>
+        <w:rPr>
+          <w:rFonts w:ascii="Times New Roman" w:hAnsi="Times New Roman" w:cs="Times New Roman"/>
+          <w:b/>
+          <w:bCs/>
+          <w:color w:val="0D0D0D" w:themeColor="text1" w:themeTint="F2"/>
+          <w:lang w:val="en-CA"/>
+        </w:rPr>
+        <w:t>Hybrid: E–F anchors (symbols for empty/full), a long bar for proportion, and numeric detail (70.6% (3.3 gal)) for precision and real planning.</w:t>
+      </w:r>
+    </w:p>
+    <w:p>
+      <w:pPr>
+        <w:numPr>
+          <w:ilvl w:val="0"/>
+          <w:numId w:val="2"/>
+        </w:numPr>
+        <w:spacing w:line="480" w:lineRule="auto"/>
+        <w:rPr>
+          <w:rFonts w:ascii="Times New Roman" w:hAnsi="Times New Roman" w:cs="Times New Roman"/>
+          <w:b/>
+          <w:bCs/>
+          <w:color w:val="0D0D0D" w:themeColor="text1" w:themeTint="F2"/>
+          <w:lang w:val="en-CA"/>
+        </w:rPr>
+      </w:pPr>
+      <w:r>
+        <w:rPr>
+          <w:rFonts w:ascii="Times New Roman" w:hAnsi="Times New Roman" w:cs="Times New Roman"/>
+          <w:b/>
+          <w:bCs/>
+          <w:color w:val="0D0D0D" w:themeColor="text1" w:themeTint="F2"/>
+          <w:lang w:val="en-CA"/>
+        </w:rPr>
+        <w:t xml:space="preserve">Bars are good for “how much left”; numbers </w:t>
+      </w:r>
+      <w:proofErr w:type="gramStart"/>
+      <w:r>
+        <w:rPr>
+          <w:rFonts w:ascii="Times New Roman" w:hAnsi="Times New Roman" w:cs="Times New Roman"/>
+          <w:b/>
+          <w:bCs/>
+          <w:color w:val="0D0D0D" w:themeColor="text1" w:themeTint="F2"/>
+          <w:lang w:val="en-CA"/>
+        </w:rPr>
+        <w:t>answer</w:t>
+      </w:r>
+      <w:proofErr w:type="gramEnd"/>
+      <w:r>
+        <w:rPr>
+          <w:rFonts w:ascii="Times New Roman" w:hAnsi="Times New Roman" w:cs="Times New Roman"/>
+          <w:b/>
+          <w:bCs/>
+          <w:color w:val="0D0D0D" w:themeColor="text1" w:themeTint="F2"/>
+          <w:lang w:val="en-CA"/>
+        </w:rPr>
+        <w:t xml:space="preserve"> “how many gallons” and match human mental models for refueling.</w:t>
+      </w:r>
+    </w:p>
+    <w:p>
+      <w:pPr>
+        <w:spacing w:line="480" w:lineRule="auto"/>
+        <w:rPr>
+          <w:rFonts w:ascii="Times New Roman" w:hAnsi="Times New Roman" w:cs="Times New Roman"/>
+          <w:b/>
+          <w:bCs/>
+          <w:color w:val="0D0D0D" w:themeColor="text1" w:themeTint="F2"/>
+          <w:lang w:val="en-CA"/>
+        </w:rPr>
+      </w:pPr>
+      <w:r>
+        <w:rPr>
+          <w:rFonts w:ascii="Times New Roman" w:hAnsi="Times New Roman" w:cs="Times New Roman"/>
+          <w:b/>
+          <w:bCs/>
+          <w:color w:val="0D0D0D" w:themeColor="text1" w:themeTint="F2"/>
+          <w:lang w:val="en-CA"/>
+        </w:rPr>
+        <w:t>Speed</w:t>
+      </w:r>
+    </w:p>
+    <w:p>
+      <w:pPr>
+        <w:numPr>
+          <w:ilvl w:val="0"/>
+          <w:numId w:val="3"/>
+        </w:numPr>
+        <w:spacing w:line="480" w:lineRule="auto"/>
+        <w:rPr>
+          <w:rFonts w:ascii="Times New Roman" w:hAnsi="Times New Roman" w:cs="Times New Roman"/>
+          <w:b/>
+          <w:bCs/>
+          <w:color w:val="0D0D0D" w:themeColor="text1" w:themeTint="F2"/>
+          <w:lang w:val="en-CA"/>
+        </w:rPr>
+      </w:pPr>
+      <w:r>
+        <w:rPr>
+          <w:rFonts w:ascii="Times New Roman" w:hAnsi="Times New Roman" w:cs="Times New Roman"/>
+          <w:b/>
+          <w:bCs/>
+          <w:color w:val="0D0D0D" w:themeColor="text1" w:themeTint="F2"/>
+          <w:lang w:val="en-CA"/>
+        </w:rPr>
+        <w:t>Hybrid: numeric 57 (exact requirement for speed limits / law), plus a short bar for trend or “headroom” without duplicating the number as the only signal.</w:t>
+      </w:r>
+    </w:p>
+    <w:p>
+      <w:pPr>
+        <w:spacing w:line="480" w:lineRule="auto"/>
+        <w:rPr>
+          <w:rFonts w:ascii="Times New Roman" w:hAnsi="Times New Roman" w:cs="Times New Roman"/>
+          <w:b/>
+          <w:bCs/>
+          <w:color w:val="0D0D0D" w:themeColor="text1" w:themeTint="F2"/>
+          <w:lang w:val="en-CA"/>
+        </w:rPr>
+      </w:pPr>
+      <w:r>
+        <w:rPr>
+          <w:rFonts w:ascii="Times New Roman" w:hAnsi="Times New Roman" w:cs="Times New Roman"/>
+          <w:b/>
+          <w:bCs/>
+          <w:color w:val="0D0D0D" w:themeColor="text1" w:themeTint="F2"/>
+          <w:lang w:val="en-CA"/>
+        </w:rPr>
+        <w:t>Engine state</w:t>
+      </w:r>
+    </w:p>
+    <w:p>
+      <w:pPr>
+        <w:numPr>
+          <w:ilvl w:val="0"/>
+          <w:numId w:val="4"/>
+        </w:numPr>
+        <w:spacing w:line="480" w:lineRule="auto"/>
+        <w:rPr>
+          <w:rFonts w:ascii="Times New Roman" w:hAnsi="Times New Roman" w:cs="Times New Roman"/>
+          <w:b/>
+          <w:bCs/>
+          <w:color w:val="0D0D0D" w:themeColor="text1" w:themeTint="F2"/>
+          <w:lang w:val="en-CA"/>
+        </w:rPr>
+      </w:pPr>
+      <w:r>
+        <w:rPr>
+          <w:rFonts w:ascii="Times New Roman" w:hAnsi="Times New Roman" w:cs="Times New Roman"/>
+          <w:b/>
+          <w:bCs/>
+          <w:color w:val="0D0D0D" w:themeColor="text1" w:themeTint="F2"/>
+          <w:lang w:val="en-CA"/>
+        </w:rPr>
+        <w:t>Symbolic + textual: green dot + [NORMAL] (and the RPM context) encode state faster than a number; state is categorical (normal/warn/fault), not a continuous quantity, so a symbol + word fits better than a bar alone.</w:t>
+      </w:r>
+    </w:p>
+    <w:p>
+      <w:pPr>
+        <w:spacing w:line="480" w:lineRule="auto"/>
+        <w:rPr>
+          <w:rFonts w:ascii="Times New Roman" w:hAnsi="Times New Roman" w:cs="Times New Roman"/>
+          <w:b/>
+          <w:bCs/>
+          <w:color w:val="4EA72E" w:themeColor="accent6"/>
+          <w:sz w:val="28"/>
+          <w:szCs w:val="28"/>
+          <w:lang w:val="en-CA"/>
+        </w:rPr>
+      </w:pPr>
+    </w:p>
+    <w:p>
+      <w:pPr>
+        <w:spacing w:line="480" w:lineRule="auto"/>
+        <w:rPr>
+          <w:rFonts w:ascii="Times New Roman" w:hAnsi="Times New Roman" w:cs="Times New Roman"/>
+          <w:b/>
+          <w:bCs/>
+        </w:rPr>
+      </w:pPr>
+    </w:p>
+    <w:p>
+      <w:pPr>
+        <w:spacing w:line="480" w:lineRule="auto"/>
+        <w:rPr>
+          <w:rFonts w:ascii="Times New Roman" w:hAnsi="Times New Roman" w:cs="Times New Roman"/>
+          <w:b/>
+          <w:bCs/>
+          <w:color w:val="4EA72E" w:themeColor="accent6"/>
+          <w:sz w:val="28"/>
+          <w:szCs w:val="28"/>
+        </w:rPr>
+      </w:pPr>
+      <w:r>
+        <w:rPr>
+          <w:rFonts w:ascii="Times New Roman" w:hAnsi="Times New Roman" w:cs="Times New Roman"/>
+          <w:b/>
+          <w:bCs/>
+          <w:color w:val="4EA72E" w:themeColor="accent6"/>
+          <w:sz w:val="28"/>
+          <w:szCs w:val="28"/>
+        </w:rPr>
+        <w:lastRenderedPageBreak/>
         <w:t>7. Describe at least two relationships between subsystems, note that the relationship logic will be</w:t>
       </w:r>
       <w:r>
@@ -1585,74 +2093,58 @@
           <w:b/>
           <w:bCs/>
         </w:rPr>
-        <w:t xml:space="preserve">. </w:t>
-      </w:r>
-      <w:proofErr w:type="gramStart"/>
-      <w:r>
-        <w:rPr>
-          <w:b/>
-          <w:bCs/>
-        </w:rPr>
-        <w:t>At the moment</w:t>
-      </w:r>
-      <w:proofErr w:type="gramEnd"/>
-      <w:r>
-        <w:rPr>
-          <w:b/>
-          <w:bCs/>
-        </w:rPr>
-        <w:t>, the ECU updates derived states like RPM classification and temperature status, and the dashboard displays them. In future phases, this could become more advanced by adding warning priorities, fault messages, maintenance alerts, or smarter driver feedback based on ECU decisions.</w:t>
-      </w:r>
-    </w:p>
-    <w:p>
-      <w:pPr>
-        <w:spacing w:line="480" w:lineRule="auto"/>
-        <w:rPr>
-          <w:rFonts w:ascii="Times New Roman" w:hAnsi="Times New Roman" w:cs="Times New Roman"/>
-          <w:b/>
-          <w:bCs/>
-        </w:rPr>
-      </w:pPr>
-    </w:p>
-    <w:p>
-      <w:pPr>
-        <w:spacing w:line="480" w:lineRule="auto"/>
-        <w:rPr>
-          <w:rFonts w:ascii="Times New Roman" w:hAnsi="Times New Roman" w:cs="Times New Roman"/>
-          <w:b/>
-          <w:bCs/>
-          <w:color w:val="4EA72E" w:themeColor="accent6"/>
-          <w:sz w:val="28"/>
-          <w:szCs w:val="28"/>
-        </w:rPr>
-      </w:pPr>
-      <w:r>
-        <w:rPr>
-          <w:rFonts w:ascii="Times New Roman" w:hAnsi="Times New Roman" w:cs="Times New Roman"/>
-          <w:b/>
-          <w:bCs/>
-          <w:color w:val="4EA72E" w:themeColor="accent6"/>
-          <w:sz w:val="28"/>
-          <w:szCs w:val="28"/>
+        <w:t>. At the moment, the ECU updates derived states like RPM classification and temperature status, and the dashboard displays them. In future phases, this could become more advanced by adding warning priorities, fault messages, maintenance alerts, or smarter driver feedback based on ECU decisions.</w:t>
+      </w:r>
+    </w:p>
+    <w:p>
+      <w:pPr>
+        <w:spacing w:line="480" w:lineRule="auto"/>
+        <w:rPr>
+          <w:rFonts w:ascii="Times New Roman" w:hAnsi="Times New Roman" w:cs="Times New Roman"/>
+          <w:b/>
+          <w:bCs/>
+        </w:rPr>
+      </w:pPr>
+    </w:p>
+    <w:p>
+      <w:pPr>
+        <w:spacing w:line="480" w:lineRule="auto"/>
+        <w:rPr>
+          <w:rFonts w:ascii="Times New Roman" w:hAnsi="Times New Roman" w:cs="Times New Roman"/>
+          <w:b/>
+          <w:bCs/>
+          <w:color w:val="4EA72E" w:themeColor="accent6"/>
+          <w:sz w:val="28"/>
+          <w:szCs w:val="28"/>
+        </w:rPr>
+      </w:pPr>
+      <w:r>
+        <w:rPr>
+          <w:rFonts w:ascii="Times New Roman" w:hAnsi="Times New Roman" w:cs="Times New Roman"/>
+          <w:b/>
+          <w:bCs/>
+          <w:color w:val="4EA72E" w:themeColor="accent6"/>
+          <w:sz w:val="28"/>
+          <w:szCs w:val="28"/>
+        </w:rPr>
+        <w:t>8. What responsibilities does your ECU handle in Phase 1?</w:t>
+      </w:r>
+    </w:p>
+    <w:p>
+      <w:pPr>
+        <w:pStyle w:val="NormalWeb"/>
+        <w:spacing w:line="480" w:lineRule="auto"/>
+        <w:rPr>
+          <w:b/>
+          <w:bCs/>
+        </w:rPr>
+      </w:pPr>
+      <w:r>
+        <w:rPr>
+          <w:b/>
+          <w:bCs/>
         </w:rPr>
         <w:lastRenderedPageBreak/>
-        <w:t>8. What responsibilities does your ECU handle in Phase 1?</w:t>
-      </w:r>
-    </w:p>
-    <w:p>
-      <w:pPr>
-        <w:pStyle w:val="NormalWeb"/>
-        <w:spacing w:line="480" w:lineRule="auto"/>
-        <w:rPr>
-          <w:b/>
-          <w:bCs/>
-        </w:rPr>
-      </w:pPr>
-      <w:r>
-        <w:rPr>
-          <w:b/>
-          <w:bCs/>
-        </w:rPr>
         <w:t xml:space="preserve">In Phase 1, our ECU is responsible for </w:t>
       </w:r>
       <w:r>
@@ -1864,23 +2356,7 @@
           <w:b/>
           <w:bCs/>
         </w:rPr>
-        <w:t xml:space="preserve"> for RPM classification, </w:t>
-      </w:r>
-      <w:proofErr w:type="gramStart"/>
-      <w:r>
-        <w:rPr>
-          <w:b/>
-          <w:bCs/>
-        </w:rPr>
-        <w:t>and also</w:t>
-      </w:r>
-      <w:proofErr w:type="gramEnd"/>
-      <w:r>
-        <w:rPr>
-          <w:b/>
-          <w:bCs/>
-        </w:rPr>
-        <w:t xml:space="preserve"> read by the </w:t>
+        <w:t xml:space="preserve"> for RPM classification, and also read by the </w:t>
       </w:r>
       <w:proofErr w:type="spellStart"/>
       <w:r>
@@ -2194,6 +2670,619 @@
     </w:sectPr>
   </w:body>
 </w:document>
+</file>
+
+<file path=word/numbering.xml><?xml version="1.0" encoding="utf-8"?>
+<w:numbering xmlns:wpc="http://schemas.microsoft.com/office/word/2010/wordprocessingCanvas" xmlns:cx="http://schemas.microsoft.com/office/drawing/2014/chartex" xmlns:cx1="http://schemas.microsoft.com/office/drawing/2015/9/8/chartex" xmlns:cx2="http://schemas.microsoft.com/office/drawing/2015/10/21/chartex" xmlns:cx3="http://schemas.microsoft.com/office/drawing/2016/5/9/chartex" xmlns:cx4="http://schemas.microsoft.com/office/drawing/2016/5/10/chartex" xmlns:cx5="http://schemas.microsoft.com/office/drawing/2016/5/11/chartex" xmlns:cx6="http://schemas.microsoft.com/office/drawing/2016/5/12/chartex" xmlns:cx7="http://schemas.microsoft.com/office/drawing/2016/5/13/chartex" xmlns:cx8="http://schemas.microsoft.com/office/drawing/2016/5/14/chartex" xmlns:mc="http://schemas.openxmlformats.org/markup-compatibility/2006" xmlns:aink="http://schemas.microsoft.com/office/drawing/2016/ink" xmlns:am3d="http://schemas.microsoft.com/office/drawing/2017/model3d" xmlns:o="urn:schemas-microsoft-com:office:office" xmlns:oel="http://schemas.microsoft.com/office/2019/extlst" xmlns:r="http://schemas.openxmlformats.org/officeDocument/2006/relationships" xmlns:m="http://schemas.openxmlformats.org/officeDocument/2006/math" xmlns:v="urn:schemas-microsoft-com:vml" xmlns:wp14="http://schemas.microsoft.com/office/word/2010/wordprocessingDrawing" xmlns:wp="http://schemas.openxmlformats.org/drawingml/2006/wordprocessingDrawing" xmlns:w10="urn:schemas-microsoft-com:office:word" xmlns:w="http://schemas.openxmlformats.org/wordprocessingml/2006/main" xmlns:w14="http://schemas.microsoft.com/office/word/2010/wordml" xmlns:w15="http://schemas.microsoft.com/office/word/2012/wordml" xmlns:w16cex="http://schemas.microsoft.com/office/word/2018/wordml/cex" xmlns:w16cid="http://schemas.microsoft.com/office/word/2016/wordml/cid" xmlns:w16="http://schemas.microsoft.com/office/word/2018/wordml" xmlns:w16du="http://schemas.microsoft.com/office/word/2023/wordml/word16du" xmlns:w16sdtdh="http://schemas.microsoft.com/office/word/2020/wordml/sdtdatahash" xmlns:w16sdtfl="http://schemas.microsoft.com/office/word/2024/wordml/sdtformatlock" xmlns:w16se="http://schemas.microsoft.com/office/word/2015/wordml/symex" xmlns:wpg="http://schemas.microsoft.com/office/word/2010/wordprocessingGroup" xmlns:wpi="http://schemas.microsoft.com/office/word/2010/wordprocessingInk" xmlns:wne="http://schemas.microsoft.com/office/word/2006/wordml" xmlns:wps="http://schemas.microsoft.com/office/word/2010/wordprocessingShape" mc:Ignorable="w14 w15 w16se w16cid w16 w16cex w16sdtdh w16sdtfl w16du wp14">
+  <w:abstractNum w:abstractNumId="0" w15:restartNumberingAfterBreak="0">
+    <w:nsid w:val="05CC1BD8"/>
+    <w:multiLevelType w:val="multilevel"/>
+    <w:tmpl w:val="D8E8CB32"/>
+    <w:lvl w:ilvl="0">
+      <w:start w:val="1"/>
+      <w:numFmt w:val="bullet"/>
+      <w:lvlText w:val=""/>
+      <w:lvlJc w:val="left"/>
+      <w:pPr>
+        <w:tabs>
+          <w:tab w:val="num" w:pos="720"/>
+        </w:tabs>
+        <w:ind w:left="720" w:hanging="360"/>
+      </w:pPr>
+      <w:rPr>
+        <w:rFonts w:ascii="Symbol" w:hAnsi="Symbol" w:hint="default"/>
+        <w:sz w:val="20"/>
+      </w:rPr>
+    </w:lvl>
+    <w:lvl w:ilvl="1" w:tentative="1">
+      <w:start w:val="1"/>
+      <w:numFmt w:val="bullet"/>
+      <w:lvlText w:val=""/>
+      <w:lvlJc w:val="left"/>
+      <w:pPr>
+        <w:tabs>
+          <w:tab w:val="num" w:pos="1440"/>
+        </w:tabs>
+        <w:ind w:left="1440" w:hanging="360"/>
+      </w:pPr>
+      <w:rPr>
+        <w:rFonts w:ascii="Symbol" w:hAnsi="Symbol" w:hint="default"/>
+        <w:sz w:val="20"/>
+      </w:rPr>
+    </w:lvl>
+    <w:lvl w:ilvl="2" w:tentative="1">
+      <w:start w:val="1"/>
+      <w:numFmt w:val="bullet"/>
+      <w:lvlText w:val=""/>
+      <w:lvlJc w:val="left"/>
+      <w:pPr>
+        <w:tabs>
+          <w:tab w:val="num" w:pos="2160"/>
+        </w:tabs>
+        <w:ind w:left="2160" w:hanging="360"/>
+      </w:pPr>
+      <w:rPr>
+        <w:rFonts w:ascii="Symbol" w:hAnsi="Symbol" w:hint="default"/>
+        <w:sz w:val="20"/>
+      </w:rPr>
+    </w:lvl>
+    <w:lvl w:ilvl="3" w:tentative="1">
+      <w:start w:val="1"/>
+      <w:numFmt w:val="bullet"/>
+      <w:lvlText w:val=""/>
+      <w:lvlJc w:val="left"/>
+      <w:pPr>
+        <w:tabs>
+          <w:tab w:val="num" w:pos="2880"/>
+        </w:tabs>
+        <w:ind w:left="2880" w:hanging="360"/>
+      </w:pPr>
+      <w:rPr>
+        <w:rFonts w:ascii="Symbol" w:hAnsi="Symbol" w:hint="default"/>
+        <w:sz w:val="20"/>
+      </w:rPr>
+    </w:lvl>
+    <w:lvl w:ilvl="4" w:tentative="1">
+      <w:start w:val="1"/>
+      <w:numFmt w:val="bullet"/>
+      <w:lvlText w:val=""/>
+      <w:lvlJc w:val="left"/>
+      <w:pPr>
+        <w:tabs>
+          <w:tab w:val="num" w:pos="3600"/>
+        </w:tabs>
+        <w:ind w:left="3600" w:hanging="360"/>
+      </w:pPr>
+      <w:rPr>
+        <w:rFonts w:ascii="Symbol" w:hAnsi="Symbol" w:hint="default"/>
+        <w:sz w:val="20"/>
+      </w:rPr>
+    </w:lvl>
+    <w:lvl w:ilvl="5" w:tentative="1">
+      <w:start w:val="1"/>
+      <w:numFmt w:val="bullet"/>
+      <w:lvlText w:val=""/>
+      <w:lvlJc w:val="left"/>
+      <w:pPr>
+        <w:tabs>
+          <w:tab w:val="num" w:pos="4320"/>
+        </w:tabs>
+        <w:ind w:left="4320" w:hanging="360"/>
+      </w:pPr>
+      <w:rPr>
+        <w:rFonts w:ascii="Symbol" w:hAnsi="Symbol" w:hint="default"/>
+        <w:sz w:val="20"/>
+      </w:rPr>
+    </w:lvl>
+    <w:lvl w:ilvl="6" w:tentative="1">
+      <w:start w:val="1"/>
+      <w:numFmt w:val="bullet"/>
+      <w:lvlText w:val=""/>
+      <w:lvlJc w:val="left"/>
+      <w:pPr>
+        <w:tabs>
+          <w:tab w:val="num" w:pos="5040"/>
+        </w:tabs>
+        <w:ind w:left="5040" w:hanging="360"/>
+      </w:pPr>
+      <w:rPr>
+        <w:rFonts w:ascii="Symbol" w:hAnsi="Symbol" w:hint="default"/>
+        <w:sz w:val="20"/>
+      </w:rPr>
+    </w:lvl>
+    <w:lvl w:ilvl="7" w:tentative="1">
+      <w:start w:val="1"/>
+      <w:numFmt w:val="bullet"/>
+      <w:lvlText w:val=""/>
+      <w:lvlJc w:val="left"/>
+      <w:pPr>
+        <w:tabs>
+          <w:tab w:val="num" w:pos="5760"/>
+        </w:tabs>
+        <w:ind w:left="5760" w:hanging="360"/>
+      </w:pPr>
+      <w:rPr>
+        <w:rFonts w:ascii="Symbol" w:hAnsi="Symbol" w:hint="default"/>
+        <w:sz w:val="20"/>
+      </w:rPr>
+    </w:lvl>
+    <w:lvl w:ilvl="8" w:tentative="1">
+      <w:start w:val="1"/>
+      <w:numFmt w:val="bullet"/>
+      <w:lvlText w:val=""/>
+      <w:lvlJc w:val="left"/>
+      <w:pPr>
+        <w:tabs>
+          <w:tab w:val="num" w:pos="6480"/>
+        </w:tabs>
+        <w:ind w:left="6480" w:hanging="360"/>
+      </w:pPr>
+      <w:rPr>
+        <w:rFonts w:ascii="Symbol" w:hAnsi="Symbol" w:hint="default"/>
+        <w:sz w:val="20"/>
+      </w:rPr>
+    </w:lvl>
+  </w:abstractNum>
+  <w:abstractNum w:abstractNumId="1" w15:restartNumberingAfterBreak="0">
+    <w:nsid w:val="0A5C11D4"/>
+    <w:multiLevelType w:val="multilevel"/>
+    <w:tmpl w:val="448AB06E"/>
+    <w:lvl w:ilvl="0">
+      <w:start w:val="1"/>
+      <w:numFmt w:val="bullet"/>
+      <w:lvlText w:val=""/>
+      <w:lvlJc w:val="left"/>
+      <w:pPr>
+        <w:tabs>
+          <w:tab w:val="num" w:pos="720"/>
+        </w:tabs>
+        <w:ind w:left="720" w:hanging="360"/>
+      </w:pPr>
+      <w:rPr>
+        <w:rFonts w:ascii="Symbol" w:hAnsi="Symbol" w:hint="default"/>
+        <w:sz w:val="20"/>
+      </w:rPr>
+    </w:lvl>
+    <w:lvl w:ilvl="1" w:tentative="1">
+      <w:start w:val="1"/>
+      <w:numFmt w:val="bullet"/>
+      <w:lvlText w:val=""/>
+      <w:lvlJc w:val="left"/>
+      <w:pPr>
+        <w:tabs>
+          <w:tab w:val="num" w:pos="1440"/>
+        </w:tabs>
+        <w:ind w:left="1440" w:hanging="360"/>
+      </w:pPr>
+      <w:rPr>
+        <w:rFonts w:ascii="Symbol" w:hAnsi="Symbol" w:hint="default"/>
+        <w:sz w:val="20"/>
+      </w:rPr>
+    </w:lvl>
+    <w:lvl w:ilvl="2" w:tentative="1">
+      <w:start w:val="1"/>
+      <w:numFmt w:val="bullet"/>
+      <w:lvlText w:val=""/>
+      <w:lvlJc w:val="left"/>
+      <w:pPr>
+        <w:tabs>
+          <w:tab w:val="num" w:pos="2160"/>
+        </w:tabs>
+        <w:ind w:left="2160" w:hanging="360"/>
+      </w:pPr>
+      <w:rPr>
+        <w:rFonts w:ascii="Symbol" w:hAnsi="Symbol" w:hint="default"/>
+        <w:sz w:val="20"/>
+      </w:rPr>
+    </w:lvl>
+    <w:lvl w:ilvl="3" w:tentative="1">
+      <w:start w:val="1"/>
+      <w:numFmt w:val="bullet"/>
+      <w:lvlText w:val=""/>
+      <w:lvlJc w:val="left"/>
+      <w:pPr>
+        <w:tabs>
+          <w:tab w:val="num" w:pos="2880"/>
+        </w:tabs>
+        <w:ind w:left="2880" w:hanging="360"/>
+      </w:pPr>
+      <w:rPr>
+        <w:rFonts w:ascii="Symbol" w:hAnsi="Symbol" w:hint="default"/>
+        <w:sz w:val="20"/>
+      </w:rPr>
+    </w:lvl>
+    <w:lvl w:ilvl="4" w:tentative="1">
+      <w:start w:val="1"/>
+      <w:numFmt w:val="bullet"/>
+      <w:lvlText w:val=""/>
+      <w:lvlJc w:val="left"/>
+      <w:pPr>
+        <w:tabs>
+          <w:tab w:val="num" w:pos="3600"/>
+        </w:tabs>
+        <w:ind w:left="3600" w:hanging="360"/>
+      </w:pPr>
+      <w:rPr>
+        <w:rFonts w:ascii="Symbol" w:hAnsi="Symbol" w:hint="default"/>
+        <w:sz w:val="20"/>
+      </w:rPr>
+    </w:lvl>
+    <w:lvl w:ilvl="5" w:tentative="1">
+      <w:start w:val="1"/>
+      <w:numFmt w:val="bullet"/>
+      <w:lvlText w:val=""/>
+      <w:lvlJc w:val="left"/>
+      <w:pPr>
+        <w:tabs>
+          <w:tab w:val="num" w:pos="4320"/>
+        </w:tabs>
+        <w:ind w:left="4320" w:hanging="360"/>
+      </w:pPr>
+      <w:rPr>
+        <w:rFonts w:ascii="Symbol" w:hAnsi="Symbol" w:hint="default"/>
+        <w:sz w:val="20"/>
+      </w:rPr>
+    </w:lvl>
+    <w:lvl w:ilvl="6" w:tentative="1">
+      <w:start w:val="1"/>
+      <w:numFmt w:val="bullet"/>
+      <w:lvlText w:val=""/>
+      <w:lvlJc w:val="left"/>
+      <w:pPr>
+        <w:tabs>
+          <w:tab w:val="num" w:pos="5040"/>
+        </w:tabs>
+        <w:ind w:left="5040" w:hanging="360"/>
+      </w:pPr>
+      <w:rPr>
+        <w:rFonts w:ascii="Symbol" w:hAnsi="Symbol" w:hint="default"/>
+        <w:sz w:val="20"/>
+      </w:rPr>
+    </w:lvl>
+    <w:lvl w:ilvl="7" w:tentative="1">
+      <w:start w:val="1"/>
+      <w:numFmt w:val="bullet"/>
+      <w:lvlText w:val=""/>
+      <w:lvlJc w:val="left"/>
+      <w:pPr>
+        <w:tabs>
+          <w:tab w:val="num" w:pos="5760"/>
+        </w:tabs>
+        <w:ind w:left="5760" w:hanging="360"/>
+      </w:pPr>
+      <w:rPr>
+        <w:rFonts w:ascii="Symbol" w:hAnsi="Symbol" w:hint="default"/>
+        <w:sz w:val="20"/>
+      </w:rPr>
+    </w:lvl>
+    <w:lvl w:ilvl="8" w:tentative="1">
+      <w:start w:val="1"/>
+      <w:numFmt w:val="bullet"/>
+      <w:lvlText w:val=""/>
+      <w:lvlJc w:val="left"/>
+      <w:pPr>
+        <w:tabs>
+          <w:tab w:val="num" w:pos="6480"/>
+        </w:tabs>
+        <w:ind w:left="6480" w:hanging="360"/>
+      </w:pPr>
+      <w:rPr>
+        <w:rFonts w:ascii="Symbol" w:hAnsi="Symbol" w:hint="default"/>
+        <w:sz w:val="20"/>
+      </w:rPr>
+    </w:lvl>
+  </w:abstractNum>
+  <w:abstractNum w:abstractNumId="2" w15:restartNumberingAfterBreak="0">
+    <w:nsid w:val="25D216FA"/>
+    <w:multiLevelType w:val="multilevel"/>
+    <w:tmpl w:val="75604712"/>
+    <w:lvl w:ilvl="0">
+      <w:start w:val="1"/>
+      <w:numFmt w:val="bullet"/>
+      <w:lvlText w:val=""/>
+      <w:lvlJc w:val="left"/>
+      <w:pPr>
+        <w:tabs>
+          <w:tab w:val="num" w:pos="720"/>
+        </w:tabs>
+        <w:ind w:left="720" w:hanging="360"/>
+      </w:pPr>
+      <w:rPr>
+        <w:rFonts w:ascii="Symbol" w:hAnsi="Symbol" w:hint="default"/>
+        <w:sz w:val="20"/>
+      </w:rPr>
+    </w:lvl>
+    <w:lvl w:ilvl="1" w:tentative="1">
+      <w:start w:val="1"/>
+      <w:numFmt w:val="bullet"/>
+      <w:lvlText w:val=""/>
+      <w:lvlJc w:val="left"/>
+      <w:pPr>
+        <w:tabs>
+          <w:tab w:val="num" w:pos="1440"/>
+        </w:tabs>
+        <w:ind w:left="1440" w:hanging="360"/>
+      </w:pPr>
+      <w:rPr>
+        <w:rFonts w:ascii="Symbol" w:hAnsi="Symbol" w:hint="default"/>
+        <w:sz w:val="20"/>
+      </w:rPr>
+    </w:lvl>
+    <w:lvl w:ilvl="2" w:tentative="1">
+      <w:start w:val="1"/>
+      <w:numFmt w:val="bullet"/>
+      <w:lvlText w:val=""/>
+      <w:lvlJc w:val="left"/>
+      <w:pPr>
+        <w:tabs>
+          <w:tab w:val="num" w:pos="2160"/>
+        </w:tabs>
+        <w:ind w:left="2160" w:hanging="360"/>
+      </w:pPr>
+      <w:rPr>
+        <w:rFonts w:ascii="Symbol" w:hAnsi="Symbol" w:hint="default"/>
+        <w:sz w:val="20"/>
+      </w:rPr>
+    </w:lvl>
+    <w:lvl w:ilvl="3" w:tentative="1">
+      <w:start w:val="1"/>
+      <w:numFmt w:val="bullet"/>
+      <w:lvlText w:val=""/>
+      <w:lvlJc w:val="left"/>
+      <w:pPr>
+        <w:tabs>
+          <w:tab w:val="num" w:pos="2880"/>
+        </w:tabs>
+        <w:ind w:left="2880" w:hanging="360"/>
+      </w:pPr>
+      <w:rPr>
+        <w:rFonts w:ascii="Symbol" w:hAnsi="Symbol" w:hint="default"/>
+        <w:sz w:val="20"/>
+      </w:rPr>
+    </w:lvl>
+    <w:lvl w:ilvl="4" w:tentative="1">
+      <w:start w:val="1"/>
+      <w:numFmt w:val="bullet"/>
+      <w:lvlText w:val=""/>
+      <w:lvlJc w:val="left"/>
+      <w:pPr>
+        <w:tabs>
+          <w:tab w:val="num" w:pos="3600"/>
+        </w:tabs>
+        <w:ind w:left="3600" w:hanging="360"/>
+      </w:pPr>
+      <w:rPr>
+        <w:rFonts w:ascii="Symbol" w:hAnsi="Symbol" w:hint="default"/>
+        <w:sz w:val="20"/>
+      </w:rPr>
+    </w:lvl>
+    <w:lvl w:ilvl="5" w:tentative="1">
+      <w:start w:val="1"/>
+      <w:numFmt w:val="bullet"/>
+      <w:lvlText w:val=""/>
+      <w:lvlJc w:val="left"/>
+      <w:pPr>
+        <w:tabs>
+          <w:tab w:val="num" w:pos="4320"/>
+        </w:tabs>
+        <w:ind w:left="4320" w:hanging="360"/>
+      </w:pPr>
+      <w:rPr>
+        <w:rFonts w:ascii="Symbol" w:hAnsi="Symbol" w:hint="default"/>
+        <w:sz w:val="20"/>
+      </w:rPr>
+    </w:lvl>
+    <w:lvl w:ilvl="6" w:tentative="1">
+      <w:start w:val="1"/>
+      <w:numFmt w:val="bullet"/>
+      <w:lvlText w:val=""/>
+      <w:lvlJc w:val="left"/>
+      <w:pPr>
+        <w:tabs>
+          <w:tab w:val="num" w:pos="5040"/>
+        </w:tabs>
+        <w:ind w:left="5040" w:hanging="360"/>
+      </w:pPr>
+      <w:rPr>
+        <w:rFonts w:ascii="Symbol" w:hAnsi="Symbol" w:hint="default"/>
+        <w:sz w:val="20"/>
+      </w:rPr>
+    </w:lvl>
+    <w:lvl w:ilvl="7" w:tentative="1">
+      <w:start w:val="1"/>
+      <w:numFmt w:val="bullet"/>
+      <w:lvlText w:val=""/>
+      <w:lvlJc w:val="left"/>
+      <w:pPr>
+        <w:tabs>
+          <w:tab w:val="num" w:pos="5760"/>
+        </w:tabs>
+        <w:ind w:left="5760" w:hanging="360"/>
+      </w:pPr>
+      <w:rPr>
+        <w:rFonts w:ascii="Symbol" w:hAnsi="Symbol" w:hint="default"/>
+        <w:sz w:val="20"/>
+      </w:rPr>
+    </w:lvl>
+    <w:lvl w:ilvl="8" w:tentative="1">
+      <w:start w:val="1"/>
+      <w:numFmt w:val="bullet"/>
+      <w:lvlText w:val=""/>
+      <w:lvlJc w:val="left"/>
+      <w:pPr>
+        <w:tabs>
+          <w:tab w:val="num" w:pos="6480"/>
+        </w:tabs>
+        <w:ind w:left="6480" w:hanging="360"/>
+      </w:pPr>
+      <w:rPr>
+        <w:rFonts w:ascii="Symbol" w:hAnsi="Symbol" w:hint="default"/>
+        <w:sz w:val="20"/>
+      </w:rPr>
+    </w:lvl>
+  </w:abstractNum>
+  <w:abstractNum w:abstractNumId="3" w15:restartNumberingAfterBreak="0">
+    <w:nsid w:val="5B813FDD"/>
+    <w:multiLevelType w:val="multilevel"/>
+    <w:tmpl w:val="74FA1E2E"/>
+    <w:lvl w:ilvl="0">
+      <w:start w:val="1"/>
+      <w:numFmt w:val="bullet"/>
+      <w:lvlText w:val=""/>
+      <w:lvlJc w:val="left"/>
+      <w:pPr>
+        <w:tabs>
+          <w:tab w:val="num" w:pos="720"/>
+        </w:tabs>
+        <w:ind w:left="720" w:hanging="360"/>
+      </w:pPr>
+      <w:rPr>
+        <w:rFonts w:ascii="Symbol" w:hAnsi="Symbol" w:hint="default"/>
+        <w:sz w:val="20"/>
+      </w:rPr>
+    </w:lvl>
+    <w:lvl w:ilvl="1" w:tentative="1">
+      <w:start w:val="1"/>
+      <w:numFmt w:val="bullet"/>
+      <w:lvlText w:val=""/>
+      <w:lvlJc w:val="left"/>
+      <w:pPr>
+        <w:tabs>
+          <w:tab w:val="num" w:pos="1440"/>
+        </w:tabs>
+        <w:ind w:left="1440" w:hanging="360"/>
+      </w:pPr>
+      <w:rPr>
+        <w:rFonts w:ascii="Symbol" w:hAnsi="Symbol" w:hint="default"/>
+        <w:sz w:val="20"/>
+      </w:rPr>
+    </w:lvl>
+    <w:lvl w:ilvl="2" w:tentative="1">
+      <w:start w:val="1"/>
+      <w:numFmt w:val="bullet"/>
+      <w:lvlText w:val=""/>
+      <w:lvlJc w:val="left"/>
+      <w:pPr>
+        <w:tabs>
+          <w:tab w:val="num" w:pos="2160"/>
+        </w:tabs>
+        <w:ind w:left="2160" w:hanging="360"/>
+      </w:pPr>
+      <w:rPr>
+        <w:rFonts w:ascii="Symbol" w:hAnsi="Symbol" w:hint="default"/>
+        <w:sz w:val="20"/>
+      </w:rPr>
+    </w:lvl>
+    <w:lvl w:ilvl="3" w:tentative="1">
+      <w:start w:val="1"/>
+      <w:numFmt w:val="bullet"/>
+      <w:lvlText w:val=""/>
+      <w:lvlJc w:val="left"/>
+      <w:pPr>
+        <w:tabs>
+          <w:tab w:val="num" w:pos="2880"/>
+        </w:tabs>
+        <w:ind w:left="2880" w:hanging="360"/>
+      </w:pPr>
+      <w:rPr>
+        <w:rFonts w:ascii="Symbol" w:hAnsi="Symbol" w:hint="default"/>
+        <w:sz w:val="20"/>
+      </w:rPr>
+    </w:lvl>
+    <w:lvl w:ilvl="4" w:tentative="1">
+      <w:start w:val="1"/>
+      <w:numFmt w:val="bullet"/>
+      <w:lvlText w:val=""/>
+      <w:lvlJc w:val="left"/>
+      <w:pPr>
+        <w:tabs>
+          <w:tab w:val="num" w:pos="3600"/>
+        </w:tabs>
+        <w:ind w:left="3600" w:hanging="360"/>
+      </w:pPr>
+      <w:rPr>
+        <w:rFonts w:ascii="Symbol" w:hAnsi="Symbol" w:hint="default"/>
+        <w:sz w:val="20"/>
+      </w:rPr>
+    </w:lvl>
+    <w:lvl w:ilvl="5" w:tentative="1">
+      <w:start w:val="1"/>
+      <w:numFmt w:val="bullet"/>
+      <w:lvlText w:val=""/>
+      <w:lvlJc w:val="left"/>
+      <w:pPr>
+        <w:tabs>
+          <w:tab w:val="num" w:pos="4320"/>
+        </w:tabs>
+        <w:ind w:left="4320" w:hanging="360"/>
+      </w:pPr>
+      <w:rPr>
+        <w:rFonts w:ascii="Symbol" w:hAnsi="Symbol" w:hint="default"/>
+        <w:sz w:val="20"/>
+      </w:rPr>
+    </w:lvl>
+    <w:lvl w:ilvl="6" w:tentative="1">
+      <w:start w:val="1"/>
+      <w:numFmt w:val="bullet"/>
+      <w:lvlText w:val=""/>
+      <w:lvlJc w:val="left"/>
+      <w:pPr>
+        <w:tabs>
+          <w:tab w:val="num" w:pos="5040"/>
+        </w:tabs>
+        <w:ind w:left="5040" w:hanging="360"/>
+      </w:pPr>
+      <w:rPr>
+        <w:rFonts w:ascii="Symbol" w:hAnsi="Symbol" w:hint="default"/>
+        <w:sz w:val="20"/>
+      </w:rPr>
+    </w:lvl>
+    <w:lvl w:ilvl="7" w:tentative="1">
+      <w:start w:val="1"/>
+      <w:numFmt w:val="bullet"/>
+      <w:lvlText w:val=""/>
+      <w:lvlJc w:val="left"/>
+      <w:pPr>
+        <w:tabs>
+          <w:tab w:val="num" w:pos="5760"/>
+        </w:tabs>
+        <w:ind w:left="5760" w:hanging="360"/>
+      </w:pPr>
+      <w:rPr>
+        <w:rFonts w:ascii="Symbol" w:hAnsi="Symbol" w:hint="default"/>
+        <w:sz w:val="20"/>
+      </w:rPr>
+    </w:lvl>
+    <w:lvl w:ilvl="8" w:tentative="1">
+      <w:start w:val="1"/>
+      <w:numFmt w:val="bullet"/>
+      <w:lvlText w:val=""/>
+      <w:lvlJc w:val="left"/>
+      <w:pPr>
+        <w:tabs>
+          <w:tab w:val="num" w:pos="6480"/>
+        </w:tabs>
+        <w:ind w:left="6480" w:hanging="360"/>
+      </w:pPr>
+      <w:rPr>
+        <w:rFonts w:ascii="Symbol" w:hAnsi="Symbol" w:hint="default"/>
+        <w:sz w:val="20"/>
+      </w:rPr>
+    </w:lvl>
+  </w:abstractNum>
+  <w:num w:numId="1" w16cid:durableId="1487547775">
+    <w:abstractNumId w:val="0"/>
+  </w:num>
+  <w:num w:numId="2" w16cid:durableId="1966230658">
+    <w:abstractNumId w:val="2"/>
+  </w:num>
+  <w:num w:numId="3" w16cid:durableId="596980021">
+    <w:abstractNumId w:val="3"/>
+  </w:num>
+  <w:num w:numId="4" w16cid:durableId="251933360">
+    <w:abstractNumId w:val="1"/>
+  </w:num>
+</w:numbering>
 </file>
 
 <file path=word/styles.xml><?xml version="1.0" encoding="utf-8"?>
@@ -2799,7 +3888,6 @@
   <w:style w:type="character" w:default="1" w:styleId="DefaultParagraphFont">
     <w:name w:val="Default Paragraph Font"/>
     <w:uiPriority w:val="1"/>
-    <w:semiHidden/>
     <w:unhideWhenUsed/>
   </w:style>
   <w:style w:type="table" w:default="1" w:styleId="TableNormal">

</xml_diff>